<commit_message>
Cập nhật mẫu Word QĐ giao nhiệm vụ TVTK 110kV.
Co-authored-by: Cursor <cursoragent@cursor.com>
</commit_message>
<xml_diff>
--- a/public/templates/qd-giao-nhiem-vu-tvtk_110.docx
+++ b/public/templates/qd-giao-nhiem-vu-tvtk_110.docx
@@ -1,6 +1,6 @@
 
 <file path=word/document.xml><?xml version="1.0" encoding="utf-8"?>
-<w:document xmlns:wpc="http://schemas.microsoft.com/office/word/2010/wordprocessingCanvas" xmlns:cx="http://schemas.microsoft.com/office/drawing/2014/chartex" xmlns:cx1="http://schemas.microsoft.com/office/drawing/2015/9/8/chartex" xmlns:cx2="http://schemas.microsoft.com/office/drawing/2015/10/21/chartex" xmlns:cx3="http://schemas.microsoft.com/office/drawing/2016/5/9/chartex" xmlns:cx4="http://schemas.microsoft.com/office/drawing/2016/5/10/chartex" xmlns:cx5="http://schemas.microsoft.com/office/drawing/2016/5/11/chartex" xmlns:cx6="http://schemas.microsoft.com/office/drawing/2016/5/12/chartex" xmlns:cx7="http://schemas.microsoft.com/office/drawing/2016/5/13/chartex" xmlns:cx8="http://schemas.microsoft.com/office/drawing/2016/5/14/chartex" xmlns:mc="http://schemas.openxmlformats.org/markup-compatibility/2006" xmlns:aink="http://schemas.microsoft.com/office/drawing/2016/ink" xmlns:am3d="http://schemas.microsoft.com/office/drawing/2017/model3d" xmlns:o="urn:schemas-microsoft-com:office:office" xmlns:oel="http://schemas.microsoft.com/office/2019/extlst" xmlns:r="http://schemas.openxmlformats.org/officeDocument/2006/relationships" xmlns:m="http://schemas.openxmlformats.org/officeDocument/2006/math" xmlns:v="urn:schemas-microsoft-com:vml" xmlns:wp14="http://schemas.microsoft.com/office/word/2010/wordprocessingDrawing" xmlns:wp="http://schemas.openxmlformats.org/drawingml/2006/wordprocessingDrawing" xmlns:w10="urn:schemas-microsoft-com:office:word" xmlns:w="http://schemas.openxmlformats.org/wordprocessingml/2006/main" xmlns:w14="http://schemas.microsoft.com/office/word/2010/wordml" xmlns:w15="http://schemas.microsoft.com/office/word/2012/wordml" xmlns:w16cex="http://schemas.microsoft.com/office/word/2018/wordml/cex" xmlns:w16cid="http://schemas.microsoft.com/office/word/2016/wordml/cid" xmlns:w16="http://schemas.microsoft.com/office/word/2018/wordml" xmlns:w16du="http://schemas.microsoft.com/office/word/2023/wordml/word16du" xmlns:w16sdtdh="http://schemas.microsoft.com/office/word/2020/wordml/sdtdatahash" xmlns:w16sdtfl="http://schemas.microsoft.com/office/word/2024/wordml/sdtformatlock" xmlns:w16se="http://schemas.microsoft.com/office/word/2015/wordml/symex" xmlns:wpg="http://schemas.microsoft.com/office/word/2010/wordprocessingGroup" xmlns:wpi="http://schemas.microsoft.com/office/word/2010/wordprocessingInk" xmlns:wne="http://schemas.microsoft.com/office/word/2006/wordml" xmlns:wps="http://schemas.microsoft.com/office/word/2010/wordprocessingShape" mc:Ignorable="w14 w15 w16se w16cid w16 w16cex w16sdtdh w16sdtfl w16du wp14">
+<w:document xmlns:wpc="http://schemas.microsoft.com/office/word/2010/wordprocessingCanvas" xmlns:cx="http://schemas.microsoft.com/office/drawing/2014/chartex" xmlns:cx1="http://schemas.microsoft.com/office/drawing/2015/9/8/chartex" xmlns:cx2="http://schemas.microsoft.com/office/drawing/2015/10/21/chartex" xmlns:cx3="http://schemas.microsoft.com/office/drawing/2016/5/9/chartex" xmlns:cx4="http://schemas.microsoft.com/office/drawing/2016/5/10/chartex" xmlns:cx5="http://schemas.microsoft.com/office/drawing/2016/5/11/chartex" xmlns:cx6="http://schemas.microsoft.com/office/drawing/2016/5/12/chartex" xmlns:cx7="http://schemas.microsoft.com/office/drawing/2016/5/13/chartex" xmlns:cx8="http://schemas.microsoft.com/office/drawing/2016/5/14/chartex" xmlns:mc="http://schemas.openxmlformats.org/markup-compatibility/2006" xmlns:aink="http://schemas.microsoft.com/office/drawing/2016/ink" xmlns:am3d="http://schemas.microsoft.com/office/drawing/2017/model3d" xmlns:o="urn:schemas-microsoft-com:office:office" xmlns:oel="http://schemas.microsoft.com/office/2019/extlst" xmlns:r="http://schemas.openxmlformats.org/officeDocument/2006/relationships" xmlns:m="http://schemas.openxmlformats.org/officeDocument/2006/math" xmlns:v="urn:schemas-microsoft-com:vml" xmlns:wp14="http://schemas.microsoft.com/office/word/2010/wordprocessingDrawing" xmlns:wp="http://schemas.openxmlformats.org/drawingml/2006/wordprocessingDrawing" xmlns:w10="urn:schemas-microsoft-com:office:word" xmlns:w="http://schemas.openxmlformats.org/wordprocessingml/2006/main" xmlns:w14="http://schemas.microsoft.com/office/word/2010/wordml" xmlns:w15="http://schemas.microsoft.com/office/word/2012/wordml" xmlns:w16cei="http://schemas.microsoft.com/office/word/2026/wordml/cei" xmlns:w16cex="http://schemas.microsoft.com/office/word/2018/wordml/cex" xmlns:w16cid="http://schemas.microsoft.com/office/word/2016/wordml/cid" xmlns:w16="http://schemas.microsoft.com/office/word/2018/wordml" xmlns:w16du="http://schemas.microsoft.com/office/word/2023/wordml/word16du" xmlns:w16sdtdh="http://schemas.microsoft.com/office/word/2020/wordml/sdtdatahash" xmlns:w16sdtfl="http://schemas.microsoft.com/office/word/2024/wordml/sdtformatlock" xmlns:w16se="http://schemas.microsoft.com/office/word/2015/wordml/symex" xmlns:wpg="http://schemas.microsoft.com/office/word/2010/wordprocessingGroup" xmlns:wpi="http://schemas.microsoft.com/office/word/2010/wordprocessingInk" xmlns:wne="http://schemas.microsoft.com/office/word/2006/wordml" xmlns:wps="http://schemas.microsoft.com/office/word/2010/wordprocessingShape" mc:Ignorable="w14 w15 w16se w16cid w16 w16cex w16sdtdh w16sdtfl w16du wp14">
   <w:body>
     <w:tbl>
       <w:tblPr>
@@ -128,7 +128,7 @@
                 </mc:Choice>
                 <mc:Fallback>
                   <w:pict>
-                    <v:line w14:anchorId="2EABEC1D" id="Straight Connector 1" o:spid="_x0000_s1026" style="position:absolute;z-index:251656192;visibility:visible;mso-wrap-style:square;mso-wrap-distance-left:9pt;mso-wrap-distance-top:0;mso-wrap-distance-right:9pt;mso-wrap-distance-bottom:0;mso-position-horizontal:center;mso-position-horizontal-relative:margin;mso-position-vertical:absolute;mso-position-vertical-relative:text" from="0,14.7pt" to="105.75pt,14.7pt" o:gfxdata="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" strokecolor="black [3040]" strokeweight=".5pt">
+                    <v:line w14:anchorId="23936584" id="Straight Connector 1" o:spid="_x0000_s1026" style="position:absolute;z-index:251656192;visibility:visible;mso-wrap-style:square;mso-wrap-distance-left:9pt;mso-wrap-distance-top:0;mso-wrap-distance-right:9pt;mso-wrap-distance-bottom:0;mso-position-horizontal:center;mso-position-horizontal-relative:margin;mso-position-vertical:absolute;mso-position-vertical-relative:text" from="0,14.7pt" to="105.75pt,14.7pt" o:gfxdata="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" strokecolor="black [3040]" strokeweight=".5pt">
                       <w10:wrap anchorx="margin"/>
                     </v:line>
                   </w:pict>
@@ -251,7 +251,7 @@
                 </mc:Choice>
                 <mc:Fallback>
                   <w:pict>
-                    <v:line w14:anchorId="1B1FB4CD" id="Straight Connector 2" o:spid="_x0000_s1026" style="position:absolute;z-index:251660288;visibility:visible;mso-wrap-style:square;mso-width-percent:0;mso-wrap-distance-left:9pt;mso-wrap-distance-top:0;mso-wrap-distance-right:9pt;mso-wrap-distance-bottom:0;mso-position-horizontal:absolute;mso-position-horizontal-relative:margin;mso-position-vertical:absolute;mso-position-vertical-relative:text;mso-width-percent:0;mso-width-relative:margin" from="41.4pt,14.85pt" to="188.65pt,14.85pt" o:gfxdata="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" strokecolor="black [3040]" strokeweight=".5pt">
+                    <v:line w14:anchorId="74B8ABFE" id="Straight Connector 2" o:spid="_x0000_s1026" style="position:absolute;z-index:251660288;visibility:visible;mso-wrap-style:square;mso-width-percent:0;mso-wrap-distance-left:9pt;mso-wrap-distance-top:0;mso-wrap-distance-right:9pt;mso-wrap-distance-bottom:0;mso-position-horizontal:absolute;mso-position-horizontal-relative:margin;mso-position-vertical:absolute;mso-position-vertical-relative:text;mso-width-percent:0;mso-width-relative:margin" from="41.4pt,14.85pt" to="188.65pt,14.85pt" o:gfxdata="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" strokecolor="black [3040]" strokeweight=".5pt">
                       <w10:wrap anchorx="margin"/>
                     </v:line>
                   </w:pict>
@@ -410,7 +410,7 @@
           </mc:Choice>
           <mc:Fallback>
             <w:pict>
-              <v:line w14:anchorId="60F8CCB7" id="Straight Connector 3" o:spid="_x0000_s1026" style="position:absolute;z-index:251661312;visibility:visible;mso-wrap-style:square;mso-width-percent:0;mso-height-percent:0;mso-wrap-distance-left:9pt;mso-wrap-distance-top:0;mso-wrap-distance-right:9pt;mso-wrap-distance-bottom:0;mso-position-horizontal:absolute;mso-position-horizontal-relative:margin;mso-position-vertical:absolute;mso-position-vertical-relative:text;mso-width-percent:0;mso-height-percent:0;mso-width-relative:page;mso-height-relative:page" from="127.85pt,58.8pt" to="297.95pt,58.8pt" o:gfxdata="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">
+              <v:line w14:anchorId="61EBA3EC" id="Straight Connector 3" o:spid="_x0000_s1026" style="position:absolute;z-index:251661312;visibility:visible;mso-wrap-style:square;mso-width-percent:0;mso-height-percent:0;mso-wrap-distance-left:9pt;mso-wrap-distance-top:0;mso-wrap-distance-right:9pt;mso-wrap-distance-bottom:0;mso-position-horizontal:absolute;mso-position-horizontal-relative:margin;mso-position-vertical:absolute;mso-position-vertical-relative:text;mso-width-percent:0;mso-height-percent:0;mso-width-relative:page;mso-height-relative:page" from="127.85pt,58.8pt" to="297.95pt,58.8pt" o:gfxdata="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">
                 <w10:wrap anchorx="margin"/>
               </v:line>
             </w:pict>
@@ -1273,11 +1273,11 @@
         <w:tblLook w:val="04A0" w:firstRow="1" w:lastRow="0" w:firstColumn="1" w:lastColumn="0" w:noHBand="0" w:noVBand="1"/>
       </w:tblPr>
       <w:tblGrid>
-        <w:gridCol w:w="616"/>
-        <w:gridCol w:w="6403"/>
-        <w:gridCol w:w="5750"/>
-        <w:gridCol w:w="900"/>
-        <w:gridCol w:w="1373"/>
+        <w:gridCol w:w="1894"/>
+        <w:gridCol w:w="1594"/>
+        <w:gridCol w:w="2319"/>
+        <w:gridCol w:w="1997"/>
+        <w:gridCol w:w="2566"/>
       </w:tblGrid>
       <w:tr>
         <w:trPr>
@@ -1537,7 +1537,7 @@
           </w:tcPr>
           <w:p>
             <w:pPr>
-              <w:spacing w:after="40" w:line="276" w:lineRule="auto"/>
+              <w:spacing w:line="312" w:lineRule="auto"/>
               <w:jc w:val="center"/>
               <w:rPr>
                 <w:sz w:val="22"/>
@@ -1564,26 +1564,19 @@
           </w:tcPr>
           <w:p>
             <w:pPr>
-              <w:spacing w:after="40" w:line="276" w:lineRule="auto"/>
+              <w:spacing w:line="312" w:lineRule="auto"/>
               <w:rPr>
+                <w:iCs/>
                 <w:sz w:val="22"/>
               </w:rPr>
             </w:pPr>
             <w:r>
               <w:rPr>
-                <w:i/>
+                <w:iCs/>
                 <w:color w:val="CC0000"/>
                 <w:sz w:val="22"/>
               </w:rPr>
               <w:t>{ct_ten}</w:t>
-            </w:r>
-            <w:r>
-              <w:rPr>
-                <w:i/>
-                <w:color w:val="CC0000"/>
-                <w:sz w:val="22"/>
-              </w:rPr>
-              <w:br/>
             </w:r>
           </w:p>
         </w:tc>
@@ -1600,7 +1593,7 @@
           </w:tcPr>
           <w:p>
             <w:pPr>
-              <w:spacing w:after="40" w:line="276" w:lineRule="auto"/>
+              <w:spacing w:line="312" w:lineRule="auto"/>
               <w:rPr>
                 <w:sz w:val="22"/>
               </w:rPr>
@@ -1627,15 +1620,16 @@
           </w:tcPr>
           <w:p>
             <w:pPr>
-              <w:spacing w:after="40" w:line="276" w:lineRule="auto"/>
+              <w:spacing w:line="312" w:lineRule="auto"/>
               <w:jc w:val="right"/>
               <w:rPr>
+                <w:iCs/>
                 <w:sz w:val="22"/>
               </w:rPr>
             </w:pPr>
             <w:r>
               <w:rPr>
-                <w:i/>
+                <w:iCs/>
                 <w:color w:val="CC0000"/>
                 <w:sz w:val="22"/>
               </w:rPr>
@@ -1656,15 +1650,16 @@
           </w:tcPr>
           <w:p>
             <w:pPr>
-              <w:spacing w:after="40" w:line="276" w:lineRule="auto"/>
+              <w:spacing w:line="312" w:lineRule="auto"/>
               <w:jc w:val="center"/>
               <w:rPr>
+                <w:iCs/>
                 <w:sz w:val="22"/>
               </w:rPr>
             </w:pPr>
             <w:r>
               <w:rPr>
-                <w:i/>
+                <w:iCs/>
                 <w:color w:val="CC0000"/>
                 <w:sz w:val="22"/>
               </w:rPr>
@@ -1692,7 +1687,7 @@
 </file>
 
 <file path=word/numbering.xml><?xml version="1.0" encoding="utf-8"?>
-<w:numbering xmlns:wpc="http://schemas.microsoft.com/office/word/2010/wordprocessingCanvas" xmlns:cx="http://schemas.microsoft.com/office/drawing/2014/chartex" xmlns:cx1="http://schemas.microsoft.com/office/drawing/2015/9/8/chartex" xmlns:cx2="http://schemas.microsoft.com/office/drawing/2015/10/21/chartex" xmlns:cx3="http://schemas.microsoft.com/office/drawing/2016/5/9/chartex" xmlns:cx4="http://schemas.microsoft.com/office/drawing/2016/5/10/chartex" xmlns:cx5="http://schemas.microsoft.com/office/drawing/2016/5/11/chartex" xmlns:cx6="http://schemas.microsoft.com/office/drawing/2016/5/12/chartex" xmlns:cx7="http://schemas.microsoft.com/office/drawing/2016/5/13/chartex" xmlns:cx8="http://schemas.microsoft.com/office/drawing/2016/5/14/chartex" xmlns:mc="http://schemas.openxmlformats.org/markup-compatibility/2006" xmlns:aink="http://schemas.microsoft.com/office/drawing/2016/ink" xmlns:am3d="http://schemas.microsoft.com/office/drawing/2017/model3d" xmlns:o="urn:schemas-microsoft-com:office:office" xmlns:oel="http://schemas.microsoft.com/office/2019/extlst" xmlns:r="http://schemas.openxmlformats.org/officeDocument/2006/relationships" xmlns:m="http://schemas.openxmlformats.org/officeDocument/2006/math" xmlns:v="urn:schemas-microsoft-com:vml" xmlns:wp14="http://schemas.microsoft.com/office/word/2010/wordprocessingDrawing" xmlns:wp="http://schemas.openxmlformats.org/drawingml/2006/wordprocessingDrawing" xmlns:w10="urn:schemas-microsoft-com:office:word" xmlns:w="http://schemas.openxmlformats.org/wordprocessingml/2006/main" xmlns:w14="http://schemas.microsoft.com/office/word/2010/wordml" xmlns:w15="http://schemas.microsoft.com/office/word/2012/wordml" xmlns:w16cex="http://schemas.microsoft.com/office/word/2018/wordml/cex" xmlns:w16cid="http://schemas.microsoft.com/office/word/2016/wordml/cid" xmlns:w16="http://schemas.microsoft.com/office/word/2018/wordml" xmlns:w16du="http://schemas.microsoft.com/office/word/2023/wordml/word16du" xmlns:w16sdtdh="http://schemas.microsoft.com/office/word/2020/wordml/sdtdatahash" xmlns:w16sdtfl="http://schemas.microsoft.com/office/word/2024/wordml/sdtformatlock" xmlns:w16se="http://schemas.microsoft.com/office/word/2015/wordml/symex" xmlns:wpg="http://schemas.microsoft.com/office/word/2010/wordprocessingGroup" xmlns:wpi="http://schemas.microsoft.com/office/word/2010/wordprocessingInk" xmlns:wne="http://schemas.microsoft.com/office/word/2006/wordml" xmlns:wps="http://schemas.microsoft.com/office/word/2010/wordprocessingShape" mc:Ignorable="w14 w15 w16se w16cid w16 w16cex w16sdtdh w16sdtfl w16du wp14">
+<w:numbering xmlns:wpc="http://schemas.microsoft.com/office/word/2010/wordprocessingCanvas" xmlns:cx="http://schemas.microsoft.com/office/drawing/2014/chartex" xmlns:cx1="http://schemas.microsoft.com/office/drawing/2015/9/8/chartex" xmlns:cx2="http://schemas.microsoft.com/office/drawing/2015/10/21/chartex" xmlns:cx3="http://schemas.microsoft.com/office/drawing/2016/5/9/chartex" xmlns:cx4="http://schemas.microsoft.com/office/drawing/2016/5/10/chartex" xmlns:cx5="http://schemas.microsoft.com/office/drawing/2016/5/11/chartex" xmlns:cx6="http://schemas.microsoft.com/office/drawing/2016/5/12/chartex" xmlns:cx7="http://schemas.microsoft.com/office/drawing/2016/5/13/chartex" xmlns:cx8="http://schemas.microsoft.com/office/drawing/2016/5/14/chartex" xmlns:mc="http://schemas.openxmlformats.org/markup-compatibility/2006" xmlns:aink="http://schemas.microsoft.com/office/drawing/2016/ink" xmlns:am3d="http://schemas.microsoft.com/office/drawing/2017/model3d" xmlns:o="urn:schemas-microsoft-com:office:office" xmlns:oel="http://schemas.microsoft.com/office/2019/extlst" xmlns:r="http://schemas.openxmlformats.org/officeDocument/2006/relationships" xmlns:m="http://schemas.openxmlformats.org/officeDocument/2006/math" xmlns:v="urn:schemas-microsoft-com:vml" xmlns:wp14="http://schemas.microsoft.com/office/word/2010/wordprocessingDrawing" xmlns:wp="http://schemas.openxmlformats.org/drawingml/2006/wordprocessingDrawing" xmlns:w10="urn:schemas-microsoft-com:office:word" xmlns:w="http://schemas.openxmlformats.org/wordprocessingml/2006/main" xmlns:w14="http://schemas.microsoft.com/office/word/2010/wordml" xmlns:w15="http://schemas.microsoft.com/office/word/2012/wordml" xmlns:w16cei="http://schemas.microsoft.com/office/word/2026/wordml/cei" xmlns:w16cex="http://schemas.microsoft.com/office/word/2018/wordml/cex" xmlns:w16cid="http://schemas.microsoft.com/office/word/2016/wordml/cid" xmlns:w16="http://schemas.microsoft.com/office/word/2018/wordml" xmlns:w16du="http://schemas.microsoft.com/office/word/2023/wordml/word16du" xmlns:w16sdtdh="http://schemas.microsoft.com/office/word/2020/wordml/sdtdatahash" xmlns:w16sdtfl="http://schemas.microsoft.com/office/word/2024/wordml/sdtformatlock" xmlns:w16se="http://schemas.microsoft.com/office/word/2015/wordml/symex" xmlns:wpg="http://schemas.microsoft.com/office/word/2010/wordprocessingGroup" xmlns:wpi="http://schemas.microsoft.com/office/word/2010/wordprocessingInk" xmlns:wne="http://schemas.microsoft.com/office/word/2006/wordml" xmlns:wps="http://schemas.microsoft.com/office/word/2010/wordprocessingShape" mc:Ignorable="w14 w15 w16se w16cid w16 w16cex w16sdtdh w16sdtfl w16du wp14">
   <w:abstractNum w:abstractNumId="0" w15:restartNumberingAfterBreak="0">
     <w:nsid w:val="FFFFFF7C"/>
     <w:multiLevelType w:val="singleLevel"/>

</xml_diff>

<commit_message>
Đóng phiên: hub thống kê, tick công trình, ngày trống Word và danh xưng GD XN (v0.1.4).
Co-authored-by: Cursor <cursoragent@cursor.com>
</commit_message>
<xml_diff>
--- a/public/templates/qd-giao-nhiem-vu-tvtk_110.docx
+++ b/public/templates/qd-giao-nhiem-vu-tvtk_110.docx
@@ -128,7 +128,7 @@
                 </mc:Choice>
                 <mc:Fallback>
                   <w:pict>
-                    <v:line w14:anchorId="23936584" id="Straight Connector 1" o:spid="_x0000_s1026" style="position:absolute;z-index:251656192;visibility:visible;mso-wrap-style:square;mso-wrap-distance-left:9pt;mso-wrap-distance-top:0;mso-wrap-distance-right:9pt;mso-wrap-distance-bottom:0;mso-position-horizontal:center;mso-position-horizontal-relative:margin;mso-position-vertical:absolute;mso-position-vertical-relative:text" from="0,14.7pt" to="105.75pt,14.7pt" o:gfxdata="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" strokecolor="black [3040]" strokeweight=".5pt">
+                    <v:line w14:anchorId="4C7845DF" id="Straight Connector 1" o:spid="_x0000_s1026" style="position:absolute;z-index:251656192;visibility:visible;mso-wrap-style:square;mso-wrap-distance-left:9pt;mso-wrap-distance-top:0;mso-wrap-distance-right:9pt;mso-wrap-distance-bottom:0;mso-position-horizontal:center;mso-position-horizontal-relative:margin;mso-position-vertical:absolute;mso-position-vertical-relative:text" from="0,14.7pt" to="105.75pt,14.7pt" o:gfxdata="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" strokecolor="black [3040]" strokeweight=".5pt">
                       <w10:wrap anchorx="margin"/>
                     </v:line>
                   </w:pict>
@@ -251,7 +251,7 @@
                 </mc:Choice>
                 <mc:Fallback>
                   <w:pict>
-                    <v:line w14:anchorId="74B8ABFE" id="Straight Connector 2" o:spid="_x0000_s1026" style="position:absolute;z-index:251660288;visibility:visible;mso-wrap-style:square;mso-width-percent:0;mso-wrap-distance-left:9pt;mso-wrap-distance-top:0;mso-wrap-distance-right:9pt;mso-wrap-distance-bottom:0;mso-position-horizontal:absolute;mso-position-horizontal-relative:margin;mso-position-vertical:absolute;mso-position-vertical-relative:text;mso-width-percent:0;mso-width-relative:margin" from="41.4pt,14.85pt" to="188.65pt,14.85pt" o:gfxdata="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" strokecolor="black [3040]" strokeweight=".5pt">
+                    <v:line w14:anchorId="5444EED7" id="Straight Connector 2" o:spid="_x0000_s1026" style="position:absolute;z-index:251660288;visibility:visible;mso-wrap-style:square;mso-width-percent:0;mso-wrap-distance-left:9pt;mso-wrap-distance-top:0;mso-wrap-distance-right:9pt;mso-wrap-distance-bottom:0;mso-position-horizontal:absolute;mso-position-horizontal-relative:margin;mso-position-vertical:absolute;mso-position-vertical-relative:text;mso-width-percent:0;mso-width-relative:margin" from="41.4pt,14.85pt" to="188.65pt,14.85pt" o:gfxdata="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" strokecolor="black [3040]" strokeweight=".5pt">
                       <w10:wrap anchorx="margin"/>
                     </v:line>
                   </w:pict>
@@ -410,7 +410,7 @@
           </mc:Choice>
           <mc:Fallback>
             <w:pict>
-              <v:line w14:anchorId="61EBA3EC" id="Straight Connector 3" o:spid="_x0000_s1026" style="position:absolute;z-index:251661312;visibility:visible;mso-wrap-style:square;mso-width-percent:0;mso-height-percent:0;mso-wrap-distance-left:9pt;mso-wrap-distance-top:0;mso-wrap-distance-right:9pt;mso-wrap-distance-bottom:0;mso-position-horizontal:absolute;mso-position-horizontal-relative:margin;mso-position-vertical:absolute;mso-position-vertical-relative:text;mso-width-percent:0;mso-height-percent:0;mso-width-relative:page;mso-height-relative:page" from="127.85pt,58.8pt" to="297.95pt,58.8pt" o:gfxdata="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">
+              <v:line w14:anchorId="62FE5EA7" id="Straight Connector 3" o:spid="_x0000_s1026" style="position:absolute;z-index:251661312;visibility:visible;mso-wrap-style:square;mso-width-percent:0;mso-height-percent:0;mso-wrap-distance-left:9pt;mso-wrap-distance-top:0;mso-wrap-distance-right:9pt;mso-wrap-distance-bottom:0;mso-position-horizontal:absolute;mso-position-horizontal-relative:margin;mso-position-vertical:absolute;mso-position-vertical-relative:text;mso-width-percent:0;mso-height-percent:0;mso-width-relative:page;mso-height-relative:page" from="127.85pt,58.8pt" to="297.95pt,58.8pt" o:gfxdata="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">
                 <w10:wrap anchorx="margin"/>
               </v:line>
             </w:pict>
@@ -554,7 +554,7 @@
         <w:rPr>
           <w:i/>
         </w:rPr>
-        <w:t xml:space="preserve"> của Tổng công ty Điện lực miền Bắc về việc thành lập Xí nghiệp Dịch vụ Điện lực </w:t>
+        <w:t xml:space="preserve"> của Tổng công ty Điện lực miền Bắc về việc thành lập </w:t>
       </w:r>
       <w:r>
         <w:rPr>
@@ -827,10 +827,20 @@
         <w:t xml:space="preserve">khẩn trương làm việc </w:t>
       </w:r>
       <w:r>
-        <w:t>PCPT</w:t>
+        <w:t xml:space="preserve">với </w:t>
       </w:r>
       <w:r>
-        <w:t xml:space="preserve"> để thương thảo và ký hợp đồng tư vấn thiết kế</w:t>
+        <w:rPr>
+          <w:iCs/>
+          <w:color w:val="CC0000"/>
+        </w:rPr>
+        <w:t>{ten_pc_tinh}</w:t>
+      </w:r>
+      <w:r>
+        <w:t xml:space="preserve"> </w:t>
+      </w:r>
+      <w:r>
+        <w:t>để thương thảo và ký hợp đồng tư vấn thiết kế</w:t>
       </w:r>
       <w:r>
         <w:t>.</w:t>
@@ -866,7 +876,7 @@
       </w:r>
       <w:r>
         <w:rPr>
-          <w:i/>
+          <w:iCs/>
           <w:color w:val="CC0000"/>
         </w:rPr>
         <w:t>{ten_pc_tinh}</w:t>
@@ -944,9 +954,25 @@
       <w:r>
         <w:rPr>
           <w:bCs/>
+          <w:color w:val="EE0000"/>
           <w:szCs w:val="26"/>
         </w:rPr>
-        <w:t xml:space="preserve">Ông Giám </w:t>
+        <w:t>{danh_xung_gd_xn}</w:t>
+      </w:r>
+      <w:r>
+        <w:rPr>
+          <w:b/>
+          <w:color w:val="EE0000"/>
+          <w:szCs w:val="26"/>
+        </w:rPr>
+        <w:t xml:space="preserve"> </w:t>
+      </w:r>
+      <w:r>
+        <w:rPr>
+          <w:bCs/>
+          <w:szCs w:val="26"/>
+        </w:rPr>
+        <w:t xml:space="preserve">Giám </w:t>
       </w:r>
       <w:r>
         <w:rPr>
@@ -975,7 +1001,7 @@
           <w:bCs/>
           <w:szCs w:val="26"/>
         </w:rPr>
-        <w:t xml:space="preserve"> các Ông (Bà) Trưởng các phòng chức năng của Công ty có liên quan căn cứ quyết định thi hành./.</w:t>
+        <w:t xml:space="preserve"> các Ông Trưởng các phòng chức năng của Công ty có liên quan căn cứ quyết định thi hành./.</w:t>
       </w:r>
     </w:p>
     <w:tbl>

</xml_diff>